<commit_message>
Update TP - [COMPLETAR]
</commit_message>
<xml_diff>
--- a/TP/Entrega_Final_TP.docx
+++ b/TP/Entrega_Final_TP.docx
@@ -38,7 +38,7 @@
           <w:i w:val="0"/>
           <w:color w:val="666666"/>
         </w:rPr>
-        <w:t>Grupo: [COMPLETAR nombre/rol de cada integrante]</w:t>
+        <w:t>Grupo: Patricio Ureta, Daniel Ravi, Juan Pablo Seoane, Ariel Alonso Shannon</w:t>
       </w:r>
     </w:p>
     <w:p>
@@ -59,7 +59,7 @@
         <w:rPr>
           <w:color w:val="007AC3"/>
         </w:rPr>
-        <w:t>Links de acceso directo (validos al momento de la correccion)</w:t>
+        <w:t>Links de acceso directo</w:t>
       </w:r>
     </w:p>
     <w:tbl>
@@ -165,7 +165,7 @@
           </w:tcPr>
           <w:p>
             <w:r>
-              <w:t>[COMPLETAR enlace — max 3 min]</w:t>
+              <w:t>https://youtu.be/7AgJvyjOLZw</w:t>
             </w:r>
           </w:p>
         </w:tc>
@@ -193,6 +193,16 @@
         </w:tc>
       </w:tr>
     </w:tbl>
+    <w:p>
+      <w:r>
+        <w:rPr>
+          <w:b w:val="0"/>
+          <w:i/>
+          <w:color w:val="666666"/>
+        </w:rPr>
+        <w:t>Nota: el servicio esta alojado en el plan gratuito de Render, que puede redeployar de forma automatica y, al estar inactivo, la primera carga puede demorar unos segundos en levantar la aplicacion.</w:t>
+      </w:r>
+    </w:p>
     <w:p>
       <w:r>
         <w:br w:type="page"/>
@@ -235,7 +245,44 @@
           <w:b w:val="0"/>
           <w:i w:val="0"/>
         </w:rPr>
-        <w:t>[COMPLETAR por integrante]</w:t>
+        <w:t>Patricio Ureta — Análisis / Diseño / Desarrollo</w:t>
+      </w:r>
+    </w:p>
+    <w:p>
+      <w:r>
+        <w:rPr>
+          <w:b w:val="0"/>
+          <w:i w:val="0"/>
+        </w:rPr>
+        <w:t>Daniel Ravi — Analista funcional / Referente de negocio</w:t>
+      </w:r>
+    </w:p>
+    <w:p>
+      <w:r>
+        <w:rPr>
+          <w:b w:val="0"/>
+          <w:i w:val="0"/>
+        </w:rPr>
+        <w:t>Juan Pablo Seoane — QA / Pruebas de aceptación con usuarios</w:t>
+      </w:r>
+    </w:p>
+    <w:p>
+      <w:r>
+        <w:rPr>
+          <w:b w:val="0"/>
+          <w:i w:val="0"/>
+        </w:rPr>
+        <w:t>Ariel Alonso Shannon — Despliegue / Infraestructura + Documentación</w:t>
+      </w:r>
+    </w:p>
+    <w:p>
+      <w:r>
+        <w:rPr>
+          <w:b w:val="0"/>
+          <w:i/>
+          <w:color w:val="666666"/>
+        </w:rPr>
+        <w:t>Todos los integrantes realizamos el trabajo en co-work con IA.</w:t>
       </w:r>
     </w:p>
     <w:p>
@@ -330,25 +377,44 @@
       </w:r>
     </w:p>
     <w:p>
+      <w:pPr>
+        <w:jc w:val="center"/>
+      </w:pPr>
       <w:r>
-        <w:rPr>
-          <w:b/>
-          <w:i w:val="0"/>
-        </w:rPr>
-        <w:t>DIAGRAMA IMAGEN — [Arquitectura general]</w:t>
+        <w:drawing>
+          <wp:inline xmlns:a="http://schemas.openxmlformats.org/drawingml/2006/main" xmlns:pic="http://schemas.openxmlformats.org/drawingml/2006/picture">
+            <wp:extent cx="5760720" cy="8151436"/>
+            <wp:docPr id="1" name="Picture 1"/>
+            <wp:cNvGraphicFramePr>
+              <a:graphicFrameLocks noChangeAspect="1"/>
+            </wp:cNvGraphicFramePr>
+            <a:graphic>
+              <a:graphicData uri="http://schemas.openxmlformats.org/drawingml/2006/picture">
+                <pic:pic>
+                  <pic:nvPicPr>
+                    <pic:cNvPr id="0" name="arquitectura.png"/>
+                    <pic:cNvPicPr/>
+                  </pic:nvPicPr>
+                  <pic:blipFill>
+                    <a:blip r:embed="rId9"/>
+                    <a:stretch>
+                      <a:fillRect/>
+                    </a:stretch>
+                  </pic:blipFill>
+                  <pic:spPr>
+                    <a:xfrm>
+                      <a:off x="0" y="0"/>
+                      <a:ext cx="5760720" cy="8151436"/>
+                    </a:xfrm>
+                    <a:prstGeom prst="rect"/>
+                  </pic:spPr>
+                </pic:pic>
+              </a:graphicData>
+            </a:graphic>
+          </wp:inline>
+        </w:drawing>
       </w:r>
     </w:p>
-    <w:p>
-      <w:r>
-        <w:rPr>
-          <w:b w:val="0"/>
-          <w:i/>
-          <w:color w:val="666666"/>
-        </w:rPr>
-        <w:t>Fuente Mermaid: diagramas\arquitectura.mmd  (generar el PNG aparte en https://mermaid.live y guardarlo como diagramas\arquitectura.png para que se incruste a esta ubicacion).</w:t>
-      </w:r>
-    </w:p>
-    <w:p/>
     <w:p>
       <w:pPr>
         <w:pStyle w:val="Heading3"/>
@@ -370,45 +436,83 @@
       </w:r>
     </w:p>
     <w:p>
+      <w:pPr>
+        <w:jc w:val="center"/>
+      </w:pPr>
       <w:r>
-        <w:rPr>
-          <w:b/>
-          <w:i w:val="0"/>
-        </w:rPr>
-        <w:t>DIAGRAMA IMAGEN — [Flujo de agentes (metodologia de desarrollo)]</w:t>
+        <w:drawing>
+          <wp:inline xmlns:a="http://schemas.openxmlformats.org/drawingml/2006/main" xmlns:pic="http://schemas.openxmlformats.org/drawingml/2006/picture">
+            <wp:extent cx="5760720" cy="7784555"/>
+            <wp:docPr id="2" name="Picture 2"/>
+            <wp:cNvGraphicFramePr>
+              <a:graphicFrameLocks noChangeAspect="1"/>
+            </wp:cNvGraphicFramePr>
+            <a:graphic>
+              <a:graphicData uri="http://schemas.openxmlformats.org/drawingml/2006/picture">
+                <pic:pic>
+                  <pic:nvPicPr>
+                    <pic:cNvPr id="0" name="agentes_desarrollo.png"/>
+                    <pic:cNvPicPr/>
+                  </pic:nvPicPr>
+                  <pic:blipFill>
+                    <a:blip r:embed="rId10"/>
+                    <a:stretch>
+                      <a:fillRect/>
+                    </a:stretch>
+                  </pic:blipFill>
+                  <pic:spPr>
+                    <a:xfrm>
+                      <a:off x="0" y="0"/>
+                      <a:ext cx="5760720" cy="7784555"/>
+                    </a:xfrm>
+                    <a:prstGeom prst="rect"/>
+                  </pic:spPr>
+                </pic:pic>
+              </a:graphicData>
+            </a:graphic>
+          </wp:inline>
+        </w:drawing>
       </w:r>
     </w:p>
     <w:p>
+      <w:pPr>
+        <w:jc w:val="center"/>
+      </w:pPr>
       <w:r>
-        <w:rPr>
-          <w:b w:val="0"/>
-          <w:i/>
-          <w:color w:val="666666"/>
-        </w:rPr>
-        <w:t>Fuente Mermaid: diagramas\agentes_desarrollo.mmd  (generar el PNG aparte en https://mermaid.live y guardarlo como diagramas\agentes_desarrollo.png para que se incruste a esta ubicacion).</w:t>
+        <w:drawing>
+          <wp:inline xmlns:a="http://schemas.openxmlformats.org/drawingml/2006/main" xmlns:pic="http://schemas.openxmlformats.org/drawingml/2006/picture">
+            <wp:extent cx="5760720" cy="8151436"/>
+            <wp:docPr id="3" name="Picture 3"/>
+            <wp:cNvGraphicFramePr>
+              <a:graphicFrameLocks noChangeAspect="1"/>
+            </wp:cNvGraphicFramePr>
+            <a:graphic>
+              <a:graphicData uri="http://schemas.openxmlformats.org/drawingml/2006/picture">
+                <pic:pic>
+                  <pic:nvPicPr>
+                    <pic:cNvPr id="0" name="estados_ticket.png"/>
+                    <pic:cNvPicPr/>
+                  </pic:nvPicPr>
+                  <pic:blipFill>
+                    <a:blip r:embed="rId11"/>
+                    <a:stretch>
+                      <a:fillRect/>
+                    </a:stretch>
+                  </pic:blipFill>
+                  <pic:spPr>
+                    <a:xfrm>
+                      <a:off x="0" y="0"/>
+                      <a:ext cx="5760720" cy="8151436"/>
+                    </a:xfrm>
+                    <a:prstGeom prst="rect"/>
+                  </pic:spPr>
+                </pic:pic>
+              </a:graphicData>
+            </a:graphic>
+          </wp:inline>
+        </w:drawing>
       </w:r>
     </w:p>
-    <w:p/>
-    <w:p>
-      <w:r>
-        <w:rPr>
-          <w:b/>
-          <w:i w:val="0"/>
-        </w:rPr>
-        <w:t>DIAGRAMA IMAGEN — [Flujo de estados del ticket]</w:t>
-      </w:r>
-    </w:p>
-    <w:p>
-      <w:r>
-        <w:rPr>
-          <w:b w:val="0"/>
-          <w:i/>
-          <w:color w:val="666666"/>
-        </w:rPr>
-        <w:t>Fuente Mermaid: diagramas\estados_ticket.mmd  (generar el PNG aparte en https://mermaid.live y guardarlo como diagramas\estados_ticket.png para que se incruste a esta ubicacion).</w:t>
-      </w:r>
-    </w:p>
-    <w:p/>
     <w:p>
       <w:pPr>
         <w:pStyle w:val="Heading3"/>
@@ -421,25 +525,44 @@
       </w:r>
     </w:p>
     <w:p>
+      <w:pPr>
+        <w:jc w:val="center"/>
+      </w:pPr>
       <w:r>
-        <w:rPr>
-          <w:b/>
-          <w:i w:val="0"/>
-        </w:rPr>
-        <w:t>DIAGRAMA IMAGEN — [Diagrama de clases (modelo de datos)]</w:t>
+        <w:drawing>
+          <wp:inline xmlns:a="http://schemas.openxmlformats.org/drawingml/2006/main" xmlns:pic="http://schemas.openxmlformats.org/drawingml/2006/picture">
+            <wp:extent cx="5760720" cy="8146508"/>
+            <wp:docPr id="4" name="Picture 4"/>
+            <wp:cNvGraphicFramePr>
+              <a:graphicFrameLocks noChangeAspect="1"/>
+            </wp:cNvGraphicFramePr>
+            <a:graphic>
+              <a:graphicData uri="http://schemas.openxmlformats.org/drawingml/2006/picture">
+                <pic:pic>
+                  <pic:nvPicPr>
+                    <pic:cNvPr id="0" name="clases.png"/>
+                    <pic:cNvPicPr/>
+                  </pic:nvPicPr>
+                  <pic:blipFill>
+                    <a:blip r:embed="rId12"/>
+                    <a:stretch>
+                      <a:fillRect/>
+                    </a:stretch>
+                  </pic:blipFill>
+                  <pic:spPr>
+                    <a:xfrm>
+                      <a:off x="0" y="0"/>
+                      <a:ext cx="5760720" cy="8146508"/>
+                    </a:xfrm>
+                    <a:prstGeom prst="rect"/>
+                  </pic:spPr>
+                </pic:pic>
+              </a:graphicData>
+            </a:graphic>
+          </wp:inline>
+        </w:drawing>
       </w:r>
     </w:p>
-    <w:p>
-      <w:r>
-        <w:rPr>
-          <w:b w:val="0"/>
-          <w:i/>
-          <w:color w:val="666666"/>
-        </w:rPr>
-        <w:t>Fuente Mermaid: diagramas\clases.mmd  (generar el PNG aparte en https://mermaid.live y guardarlo como diagramas\clases.png para que se incruste a esta ubicacion).</w:t>
-      </w:r>
-    </w:p>
-    <w:p/>
     <w:p>
       <w:pPr>
         <w:pStyle w:val="Heading3"/>
@@ -452,25 +575,44 @@
       </w:r>
     </w:p>
     <w:p>
+      <w:pPr>
+        <w:jc w:val="center"/>
+      </w:pPr>
       <w:r>
-        <w:rPr>
-          <w:b/>
-          <w:i w:val="0"/>
-        </w:rPr>
-        <w:t>DIAGRAMA IMAGEN — [Casos de uso por rol]</w:t>
+        <w:drawing>
+          <wp:inline xmlns:a="http://schemas.openxmlformats.org/drawingml/2006/main" xmlns:pic="http://schemas.openxmlformats.org/drawingml/2006/picture">
+            <wp:extent cx="5760720" cy="7858431"/>
+            <wp:docPr id="5" name="Picture 5"/>
+            <wp:cNvGraphicFramePr>
+              <a:graphicFrameLocks noChangeAspect="1"/>
+            </wp:cNvGraphicFramePr>
+            <a:graphic>
+              <a:graphicData uri="http://schemas.openxmlformats.org/drawingml/2006/picture">
+                <pic:pic>
+                  <pic:nvPicPr>
+                    <pic:cNvPr id="0" name="casos_de_uso.png"/>
+                    <pic:cNvPicPr/>
+                  </pic:nvPicPr>
+                  <pic:blipFill>
+                    <a:blip r:embed="rId13"/>
+                    <a:stretch>
+                      <a:fillRect/>
+                    </a:stretch>
+                  </pic:blipFill>
+                  <pic:spPr>
+                    <a:xfrm>
+                      <a:off x="0" y="0"/>
+                      <a:ext cx="5760720" cy="7858431"/>
+                    </a:xfrm>
+                    <a:prstGeom prst="rect"/>
+                  </pic:spPr>
+                </pic:pic>
+              </a:graphicData>
+            </a:graphic>
+          </wp:inline>
+        </w:drawing>
       </w:r>
     </w:p>
-    <w:p>
-      <w:r>
-        <w:rPr>
-          <w:b w:val="0"/>
-          <w:i/>
-          <w:color w:val="666666"/>
-        </w:rPr>
-        <w:t>Fuente Mermaid: diagramas\casos_de_uso.mmd  (generar el PNG aparte en https://mermaid.live y guardarlo como diagramas\casos_de_uso.png para que se incruste a esta ubicacion).</w:t>
-      </w:r>
-    </w:p>
-    <w:p/>
     <w:p>
       <w:pPr>
         <w:pStyle w:val="Heading3"/>
@@ -483,25 +625,44 @@
       </w:r>
     </w:p>
     <w:p>
+      <w:pPr>
+        <w:jc w:val="center"/>
+      </w:pPr>
       <w:r>
-        <w:rPr>
-          <w:b/>
-          <w:i w:val="0"/>
-        </w:rPr>
-        <w:t>DIAGRAMA IMAGEN — [Secuencia del analisis IA]</w:t>
+        <w:drawing>
+          <wp:inline xmlns:a="http://schemas.openxmlformats.org/drawingml/2006/main" xmlns:pic="http://schemas.openxmlformats.org/drawingml/2006/picture">
+            <wp:extent cx="5760720" cy="8151436"/>
+            <wp:docPr id="6" name="Picture 6"/>
+            <wp:cNvGraphicFramePr>
+              <a:graphicFrameLocks noChangeAspect="1"/>
+            </wp:cNvGraphicFramePr>
+            <a:graphic>
+              <a:graphicData uri="http://schemas.openxmlformats.org/drawingml/2006/picture">
+                <pic:pic>
+                  <pic:nvPicPr>
+                    <pic:cNvPr id="0" name="secuencia_analisis_ia.png"/>
+                    <pic:cNvPicPr/>
+                  </pic:nvPicPr>
+                  <pic:blipFill>
+                    <a:blip r:embed="rId14"/>
+                    <a:stretch>
+                      <a:fillRect/>
+                    </a:stretch>
+                  </pic:blipFill>
+                  <pic:spPr>
+                    <a:xfrm>
+                      <a:off x="0" y="0"/>
+                      <a:ext cx="5760720" cy="8151436"/>
+                    </a:xfrm>
+                    <a:prstGeom prst="rect"/>
+                  </pic:spPr>
+                </pic:pic>
+              </a:graphicData>
+            </a:graphic>
+          </wp:inline>
+        </w:drawing>
       </w:r>
     </w:p>
-    <w:p>
-      <w:r>
-        <w:rPr>
-          <w:b w:val="0"/>
-          <w:i/>
-          <w:color w:val="666666"/>
-        </w:rPr>
-        <w:t>Fuente Mermaid: diagramas\secuencia_analisis_ia.mmd  (generar el PNG aparte en https://mermaid.live y guardarlo como diagramas\secuencia_analisis_ia.png para que se incruste a esta ubicacion).</w:t>
-      </w:r>
-    </w:p>
-    <w:p/>
     <w:p>
       <w:r>
         <w:br w:type="page"/>
@@ -823,7 +984,7 @@
         <w:drawing>
           <wp:inline xmlns:a="http://schemas.openxmlformats.org/drawingml/2006/main" xmlns:pic="http://schemas.openxmlformats.org/drawingml/2006/picture">
             <wp:extent cx="5394960" cy="3371850"/>
-            <wp:docPr id="1" name="Picture 1"/>
+            <wp:docPr id="7" name="Picture 7"/>
             <wp:cNvGraphicFramePr>
               <a:graphicFrameLocks noChangeAspect="1"/>
             </wp:cNvGraphicFramePr>
@@ -835,7 +996,7 @@
                     <pic:cNvPicPr/>
                   </pic:nvPicPr>
                   <pic:blipFill>
-                    <a:blip r:embed="rId9"/>
+                    <a:blip r:embed="rId15"/>
                     <a:stretch>
                       <a:fillRect/>
                     </a:stretch>
@@ -884,7 +1045,7 @@
         <w:drawing>
           <wp:inline xmlns:a="http://schemas.openxmlformats.org/drawingml/2006/main" xmlns:pic="http://schemas.openxmlformats.org/drawingml/2006/picture">
             <wp:extent cx="5394960" cy="3371850"/>
-            <wp:docPr id="2" name="Picture 2"/>
+            <wp:docPr id="8" name="Picture 8"/>
             <wp:cNvGraphicFramePr>
               <a:graphicFrameLocks noChangeAspect="1"/>
             </wp:cNvGraphicFramePr>
@@ -896,7 +1057,7 @@
                     <pic:cNvPicPr/>
                   </pic:nvPicPr>
                   <pic:blipFill>
-                    <a:blip r:embed="rId10"/>
+                    <a:blip r:embed="rId16"/>
                     <a:stretch>
                       <a:fillRect/>
                     </a:stretch>
@@ -945,7 +1106,7 @@
         <w:drawing>
           <wp:inline xmlns:a="http://schemas.openxmlformats.org/drawingml/2006/main" xmlns:pic="http://schemas.openxmlformats.org/drawingml/2006/picture">
             <wp:extent cx="5394960" cy="3128327"/>
-            <wp:docPr id="3" name="Picture 3"/>
+            <wp:docPr id="9" name="Picture 9"/>
             <wp:cNvGraphicFramePr>
               <a:graphicFrameLocks noChangeAspect="1"/>
             </wp:cNvGraphicFramePr>
@@ -957,7 +1118,7 @@
                     <pic:cNvPicPr/>
                   </pic:nvPicPr>
                   <pic:blipFill>
-                    <a:blip r:embed="rId11"/>
+                    <a:blip r:embed="rId17"/>
                     <a:stretch>
                       <a:fillRect/>
                     </a:stretch>
@@ -1005,7 +1166,7 @@
           <w:b w:val="0"/>
           <w:i w:val="0"/>
         </w:rPr>
-        <w:t>[COMPLETAR enlace si aplica — max 3 min]</w:t>
+        <w:t>https://youtu.be/7AgJvyjOLZw (max 3 min)</w:t>
       </w:r>
     </w:p>
     <w:p>
@@ -1888,7 +2049,7 @@
           <w:b w:val="0"/>
           <w:i w:val="0"/>
         </w:rPr>
-        <w:t>El desarrollo se hizo en dos esquemas combinados: (1) esquema multi-agente con Antigravity + Gemini como orquestador + un multiMCP adaptado para usar rotacion interna de API keys y proveedores; y (2) opencode como CLI con cambio de agente manual por tarea. Ambas modalidades se alternaron a lo largo del desarrollo y se complementaron (no hay un reparto de features por esquema: el mismo hito se pudo abordar desde cualquiera de las dos).</w:t>
+        <w:t>El desarrollo se hizo en dos esquemas combinados: (1) esquema multi-agente con Antigravity + Gemini como orquestador + un multiMCP adaptado para usar rotacion interna de API keys y proveedores; y (2) opencode como CLI con cambio de agente manual por tarea. Ambas modalidades se alternaron a lo largo del desarrollo y se complementaron (no hay un reparto de features por esquema: el mismo hito se pudo abordar desde cualquiera de las dos). El contexto original del proyecto quedo documentado en el archivo AGENTS.md dentro del repositorio, que ambas herramientas leyeron y actualizaron; asi el paso de un esquema al otro no perdia la memoria del desarrollo (conceptos, decisiones y pendientes).</w:t>
       </w:r>
     </w:p>
     <w:tbl>
@@ -2220,15 +2381,6 @@
           <w:b w:val="0"/>
           <w:i w:val="0"/>
         </w:rPr>
-        <w:t>[COMPLETAR captura tras ejecutar, p.ej.:]</w:t>
-      </w:r>
-    </w:p>
-    <w:p>
-      <w:r>
-        <w:rPr>
-          <w:b w:val="0"/>
-          <w:i w:val="0"/>
-        </w:rPr>
         <w:t>Comando: ollama run qwen2.5:3b</w:t>
       </w:r>
     </w:p>
@@ -2238,18 +2390,60 @@
           <w:b w:val="0"/>
           <w:i w:val="0"/>
         </w:rPr>
-        <w:t>Pregunta: "En una organizacion que gestiona incidencias de Financiamiento politico, que ventajas y riesgos tiene analizar esas incidencias con un LLM local versus una API en la nube?"</w:t>
+        <w:t>Pregunta: "En una organizacion que gestiona incidencias de Financiamiento politico, que ventajas y riesgos tiene analizar esas incidencias con un LLM local versus una API en la nube? Respuesta no muy larga, un parrafo corto para cada situacion de riesgo/ventaja"</w:t>
       </w:r>
     </w:p>
+    <w:p>
+      <w:pPr>
+        <w:jc w:val="center"/>
+      </w:pPr>
+      <w:r>
+        <w:drawing>
+          <wp:inline xmlns:a="http://schemas.openxmlformats.org/drawingml/2006/main" xmlns:pic="http://schemas.openxmlformats.org/drawingml/2006/picture">
+            <wp:extent cx="5394960" cy="2463452"/>
+            <wp:docPr id="10" name="Picture 10"/>
+            <wp:cNvGraphicFramePr>
+              <a:graphicFrameLocks noChangeAspect="1"/>
+            </wp:cNvGraphicFramePr>
+            <a:graphic>
+              <a:graphicData uri="http://schemas.openxmlformats.org/drawingml/2006/picture">
+                <pic:pic>
+                  <pic:nvPicPr>
+                    <pic:cNvPr id="0" name="query_ollama.png"/>
+                    <pic:cNvPicPr/>
+                  </pic:nvPicPr>
+                  <pic:blipFill>
+                    <a:blip r:embed="rId18"/>
+                    <a:stretch>
+                      <a:fillRect/>
+                    </a:stretch>
+                  </pic:blipFill>
+                  <pic:spPr>
+                    <a:xfrm>
+                      <a:off x="0" y="0"/>
+                      <a:ext cx="5394960" cy="2463452"/>
+                    </a:xfrm>
+                    <a:prstGeom prst="rect"/>
+                  </pic:spPr>
+                </pic:pic>
+              </a:graphicData>
+            </a:graphic>
+          </wp:inline>
+        </w:drawing>
+      </w:r>
+    </w:p>
+    <w:p/>
     <w:p>
       <w:r>
         <w:rPr>
           <w:b w:val="0"/>
-          <w:i w:val="0"/>
+          <w:i/>
+          <w:color w:val="666666"/>
         </w:rPr>
-        <w:t>Respuesta (1 linea): [COMPLETAR lo que respondio el modelo]</w:t>
+        <w:t>Ollama en local: ollama list + ollama run qwen2.5:3b con la pregunta del dominio y la respuesta completa del modelo.</w:t>
       </w:r>
     </w:p>
+    <w:p/>
     <w:sectPr>
       <w:pgSz w:w="12240" w:h="15840"/>
       <w:pgMar w:top="1440" w:right="1800" w:bottom="1440" w:left="1800" w:header="720" w:footer="720" w:gutter="0"/>

</xml_diff>